<commit_message>
Integrar evidencias al informe principal
</commit_message>
<xml_diff>
--- a/documentacion/entregables/Establecimiento_Controles.docx
+++ b/documentacion/entregables/Establecimiento_Controles.docx
@@ -607,6 +607,58 @@
           </w:p>
         </w:tc>
       </w:tr>
+      <w:tr>
+        <w:tc>
+          <w:tcPr>
+            <w:tcW w:type="dxa" w:w="4680"/>
+            <w:vAlign w:val="center"/>
+          </w:tcPr>
+          <w:p>
+            <w:pPr>
+              <w:jc w:val="left"/>
+            </w:pPr>
+            <w:r>
+              <w:rPr>
+                <w:rFonts w:ascii="Times New Roman" w:hAnsi="Times New Roman"/>
+                <w:sz w:val="18"/>
+              </w:rPr>
+            </w:r>
+            <w:r>
+              <w:rPr>
+                <w:rFonts w:ascii="Times New Roman" w:hAnsi="Times New Roman"/>
+                <w:b w:val="0"/>
+                <w:sz w:val="18"/>
+              </w:rPr>
+              <w:t>Cookies seguras</w:t>
+            </w:r>
+          </w:p>
+        </w:tc>
+        <w:tc>
+          <w:tcPr>
+            <w:tcW w:type="dxa" w:w="4680"/>
+            <w:vAlign w:val="center"/>
+          </w:tcPr>
+          <w:p>
+            <w:pPr>
+              <w:jc w:val="left"/>
+            </w:pPr>
+            <w:r>
+              <w:rPr>
+                <w:rFonts w:ascii="Times New Roman" w:hAnsi="Times New Roman"/>
+                <w:sz w:val="18"/>
+              </w:rPr>
+            </w:r>
+            <w:r>
+              <w:rPr>
+                <w:rFonts w:ascii="Times New Roman" w:hAnsi="Times New Roman"/>
+                <w:b w:val="0"/>
+                <w:sz w:val="18"/>
+              </w:rPr>
+              <w:t>Configurar expiracion, HttpOnly, SameSite y Secure cuando exista HTTPS.</w:t>
+            </w:r>
+          </w:p>
+        </w:tc>
+      </w:tr>
     </w:tbl>
     <w:p>
       <w:pPr>
@@ -662,6 +714,30 @@
           <w:sz w:val="24"/>
         </w:rPr>
         <w:t>Listar reglas de firewall con sudo firewall-cmd --list-all.</w:t>
+      </w:r>
+    </w:p>
+    <w:p>
+      <w:pPr>
+        <w:pStyle w:val="ListBullet"/>
+      </w:pPr>
+      <w:r>
+        <w:rPr>
+          <w:rFonts w:ascii="Times New Roman" w:hAnsi="Times New Roman"/>
+          <w:sz w:val="24"/>
+        </w:rPr>
+        <w:t>Revisar si el puerto 5355/LLMNR es necesario; si no lo es, deshabilitarlo para reducir superficie de ataque.</w:t>
+      </w:r>
+    </w:p>
+    <w:p>
+      <w:pPr>
+        <w:pStyle w:val="ListBullet"/>
+      </w:pPr>
+      <w:r>
+        <w:rPr>
+          <w:rFonts w:ascii="Times New Roman" w:hAnsi="Times New Roman"/>
+          <w:sz w:val="24"/>
+        </w:rPr>
+        <w:t>Filtrar respuestas ICMP timestamp si no se requieren para la practica.</w:t>
       </w:r>
     </w:p>
     <w:p>
@@ -1278,7 +1354,7 @@
     <w:qFormat/>
     <w:rsid w:val="00FC693F"/>
     <w:pPr>
-      <w:spacing w:line="360" w:lineRule="auto" w:after="120"/>
+      <w:spacing w:line="480" w:lineRule="auto" w:after="120"/>
     </w:pPr>
     <w:rPr>
       <w:rFonts w:ascii="Times New Roman" w:hAnsi="Times New Roman"/>

</xml_diff>

<commit_message>
Pulir informe y unificar analisis
</commit_message>
<xml_diff>
--- a/documentacion/entregables/Establecimiento_Controles.docx
+++ b/documentacion/entregables/Establecimiento_Controles.docx
@@ -14,7 +14,7 @@
         </w:rPr>
         <w:t>Universidad</w:t>
         <w:br/>
-        <w:t>Materia: Auditoria de Sistemas</w:t>
+        <w:t>Materia: Auditoría de Sistemas</w:t>
         <w:br/>
       </w:r>
     </w:p>
@@ -40,7 +40,7 @@
           <w:rFonts w:ascii="Times New Roman" w:hAnsi="Times New Roman"/>
           <w:sz w:val="24"/>
         </w:rPr>
-        <w:t>Auditoria de Seguridad y Politicas de Contrasenas para un Sistema de Ventas en un entorno Linux-Fedora 39</w:t>
+        <w:t>Auditoría de Seguridad y Políticas de Contraseñas para un Sistema de Ventas en un entorno Linux-Fedora 39</w:t>
       </w:r>
     </w:p>
     <w:p/>
@@ -125,7 +125,7 @@
           <w:rFonts w:ascii="Times New Roman" w:hAnsi="Times New Roman"/>
           <w:sz w:val="24"/>
         </w:rPr>
-        <w:t>Gestion: 2026</w:t>
+        <w:t>Gestión: 2026</w:t>
       </w:r>
     </w:p>
     <w:p>
@@ -141,9 +141,7 @@
       </w:r>
     </w:p>
     <w:p>
-      <w:r>
-        <w:br w:type="page"/>
-      </w:r>
+      <w:r/>
     </w:p>
     <w:p>
       <w:pPr>
@@ -162,7 +160,7 @@
           <w:rFonts w:ascii="Times New Roman" w:hAnsi="Times New Roman"/>
           <w:sz w:val="24"/>
         </w:rPr>
-        <w:t>Definir controles simples y aplicables para el uso seguro del sistema web de ventas y del servidor Fedora 39, con enfasis en contrasenas, acceso, operacion y cierre del laboratorio.</w:t>
+        <w:t>Definir controles simples y aplicables para el uso seguro del sistema web de ventas y del servidor Fedora 39, con enfasis en contraseñas, acceso, operacion y cierre del laboratorio.</w:t>
       </w:r>
     </w:p>
     <w:p>
@@ -238,7 +236,7 @@
                 <w:b/>
                 <w:sz w:val="18"/>
               </w:rPr>
-              <w:t>Descripcion</w:t>
+              <w:t>Descripción</w:t>
             </w:r>
           </w:p>
         </w:tc>
@@ -265,7 +263,7 @@
                 <w:b w:val="0"/>
                 <w:sz w:val="18"/>
               </w:rPr>
-              <w:t>Autenticacion</w:t>
+              <w:t>Autenticación</w:t>
             </w:r>
           </w:p>
         </w:tc>
@@ -317,7 +315,7 @@
                 <w:b w:val="0"/>
                 <w:sz w:val="18"/>
               </w:rPr>
-              <w:t>Contrasenas</w:t>
+              <w:t>Contraseñas</w:t>
             </w:r>
           </w:p>
         </w:tc>
@@ -369,7 +367,7 @@
                 <w:b w:val="0"/>
                 <w:sz w:val="18"/>
               </w:rPr>
-              <w:t>Sesiones</w:t>
+              <w:t>Sesiónes</w:t>
             </w:r>
           </w:p>
         </w:tc>
@@ -394,7 +392,7 @@
                 <w:b w:val="0"/>
                 <w:sz w:val="18"/>
               </w:rPr>
-              <w:t>Cerrar sesion al finalizar el uso del sistema.</w:t>
+              <w:t>Cerrar sesión al finalizar el uso del sistema.</w:t>
             </w:r>
           </w:p>
         </w:tc>
@@ -421,7 +419,7 @@
                 <w:b w:val="0"/>
                 <w:sz w:val="18"/>
               </w:rPr>
-              <w:t>Validacion de entradas</w:t>
+              <w:t>Validación de entradas</w:t>
             </w:r>
           </w:p>
         </w:tc>
@@ -446,7 +444,7 @@
                 <w:b w:val="0"/>
                 <w:sz w:val="18"/>
               </w:rPr>
-              <w:t>Validar y sanitizar campos de productos, clientes y busqueda.</w:t>
+              <w:t>Validar y sanitizar campos de productos, clientes y búsqueda.</w:t>
             </w:r>
           </w:p>
         </w:tc>
@@ -550,7 +548,7 @@
                 <w:b w:val="0"/>
                 <w:sz w:val="18"/>
               </w:rPr>
-              <w:t>Registrar inicios de sesion, errores y operaciones relevantes.</w:t>
+              <w:t>Registrar inicios de sesión, errores y operaciones relevantes.</w:t>
             </w:r>
           </w:p>
         </w:tc>
@@ -602,7 +600,7 @@
                 <w:b w:val="0"/>
                 <w:sz w:val="18"/>
               </w:rPr>
-              <w:t>Respaldar la base SQLite antes y despues de pruebas importantes.</w:t>
+              <w:t>Respaldar la base SQLite antes y después de pruebas importantes.</w:t>
             </w:r>
           </w:p>
         </w:tc>
@@ -749,7 +747,7 @@
           <w:rFonts w:ascii="Times New Roman" w:hAnsi="Times New Roman"/>
           <w:sz w:val="24"/>
         </w:rPr>
-        <w:t>Usar usuario no root para ejecutar la aplicacion.</w:t>
+        <w:t>Usar usuario no root para ejecutar la aplicación.</w:t>
       </w:r>
     </w:p>
     <w:p>
@@ -761,7 +759,7 @@
           <w:rFonts w:ascii="Times New Roman" w:hAnsi="Times New Roman"/>
           <w:sz w:val="24"/>
         </w:rPr>
-        <w:t>Apagar la VM o cerrar el servicio Flask al terminar la exposicion.</w:t>
+        <w:t>Apagar la VM o cerrar el servicio Flask al terminar la exposición.</w:t>
       </w:r>
     </w:p>
     <w:p>
@@ -853,7 +851,7 @@
           <w:rFonts w:ascii="Times New Roman" w:hAnsi="Times New Roman"/>
           <w:sz w:val="24"/>
         </w:rPr>
-        <w:t>Mostrar productos, clientes, ventas, reportes y busqueda.</w:t>
+        <w:t>Mostrar productos, clientes, ventas, reportes y búsqueda.</w:t>
       </w:r>
     </w:p>
     <w:p>
@@ -865,7 +863,7 @@
           <w:rFonts w:ascii="Times New Roman" w:hAnsi="Times New Roman"/>
           <w:sz w:val="24"/>
         </w:rPr>
-        <w:t>Ejecutar Nmap y Nessus desde la maquina de auditoria.</w:t>
+        <w:t>Ejecutar Nmap y Nessus desde la máquina de auditoría.</w:t>
       </w:r>
     </w:p>
     <w:p>
@@ -977,7 +975,7 @@
           <w:rFonts w:ascii="Times New Roman" w:hAnsi="Times New Roman"/>
           <w:sz w:val="24"/>
         </w:rPr>
-        <w:t>Los controles establecidos permiten reducir riesgos basicos del sistema web y del servidor, ademas de organizar la demostracion de auditoria como un laboratorio temporal, controlado y documentado.</w:t>
+        <w:t>Los controles establecidos permiten reducir riesgos básicos del sistema web y del servidor, ademas de organizar la demostracion de auditoría como un laboratorio temporal, controlado y documentado.</w:t>
       </w:r>
     </w:p>
     <w:sectPr>

</xml_diff>